<commit_message>
Correct model documentation and research claims
Co-Authored-By: Claude Opus 5.5 <noreply@anthropic.com>
Claude-Session: https://claude.ai/code/session_01Eu73DXEemZjmC2kGBKYoH3
</commit_message>
<xml_diff>
--- a/docs/Project_Review.docx
+++ b/docs/Project_Review.docx
@@ -76,6 +76,22 @@
     </w:p>
     <w:p>
       <w:pPr>
+        <w:spacing w:after="240"/>
+        <w:jc w:val="both"/>
+      </w:pPr>
+      <w:r>
+        <w:rPr>
+          <w:b/>
+          <w:bCs/>
+        </w:rPr>
+        <w:t xml:space="preserve">Status update (September 2026): </w:t>
+      </w:r>
+      <w:r>
+        <w:t xml:space="preserve">A later leakage-safe, time-based evaluation (docs/EVALUATION.md in the repository) supersedes the model claims and metrics in this review. On the current synthetic dataset, the LSTM risk score does not act as an early warning: it flags 0 of 16 first-fraud transactions in the test period and rises only after a fraud episode has started. The DNN performs the same with or without it. Statements below that describe the LSTM as a leading indicator record the original research hypothesis, not a measured result. The corrected DNN results (precision, recall and PR-AUC all 1.000) are matched by a simple amount/hour rule, because the synthetic data makes fraud easy to separate.</w:t>
+      </w:r>
+    </w:p>
+    <w:p>
+      <w:pPr>
         <w:pStyle w:val="Heading1"/>
         <w:spacing w:after="160" w:before="360"/>
       </w:pPr>
@@ -180,7 +196,7 @@
         <w:t xml:space="preserve">Problem: </w:t>
       </w:r>
       <w:r>
-        <w:t xml:space="preserve">Design and build a fraud intelligence system that (a) constructs a per-customer behavioral profile — a “Behavioral Fraud DNA” — from each customer’s own transaction history, (b) predicts a customer’s fraud-risk trajectory before an anomalous transaction occurs, (c) classifies individual incoming transactions for fraud in real time, and (d) explains every decision it makes in human-interpretable terms, so that a banking fraud analyst can trust, verify, and act on the system’s output rather than treating it as an opaque black box.</w:t>
+        <w:t xml:space="preserve">Design and build a fraud intelligence system that (a) constructs a per-customer behavioral profile — a “Behavioral Fraud DNA” — from each customer’s own transaction history, (b) scores a customer’s historical fraud risk from their prior transactions, with the aim of flagging risk before an anomalous transaction occurs, (c) classifies individual incoming transactions for fraud in real time, and (d) explains every decision it makes in human-interpretable terms, so that a banking fraud analyst can trust, verify, and act on the system’s output rather than treating it as an opaque black box.</w:t>
       </w:r>
     </w:p>
     <w:p>
@@ -189,7 +205,7 @@
         <w:jc w:val="both"/>
       </w:pPr>
       <w:r>
-        <w:t xml:space="preserve">Because real, labeled banking transaction data with device / login / location history is not publicly available (financial institutions do not release it, for obvious privacy and competitive reasons), this project constructs and uses a semi-synthetic dataset with realistic behavioral drift patterns leading up to fraud events — a standard, accepted practice in fraud-detection research, following precedent set by datasets such as PaySim.</w:t>
+        <w:t xml:space="preserve">Because real, labeled banking transaction data with device / login / location history is not publicly available (financial institutions do not release it, for obvious privacy and competitive reasons), this project constructs and uses a synthetic dataset in which each fraud episode is a burst of anomalous transactions (a milder ramp-up week, also labeled as fraud, followed by a high-severity week) — a standard, accepted practice in fraud-detection research, following precedent set by datasets such as PaySim.</w:t>
       </w:r>
     </w:p>
     <w:p>
@@ -224,7 +240,7 @@
         <w:spacing w:after="80"/>
       </w:pPr>
       <w:r>
-        <w:t xml:space="preserve">Train a sequence model (LSTM) that predicts a customer’s risk trajectory from their recent transaction history — a leading indicator, before the risky transaction itself.</w:t>
+        <w:t xml:space="preserve">Train a sequence model (LSTM) that scores a customer’s historical fraud risk from their recent transaction history, intended as a leading indicator before the risky transaction itself. (Research hypothesis; not supported on the current data. See the status update above.)</w:t>
       </w:r>
     </w:p>
     <w:p>
@@ -1510,7 +1526,7 @@
         <w:spacing w:after="80"/>
       </w:pPr>
       <w:r>
-        <w:t xml:space="preserve">Custom synthetic data generator (data/generate_synthetic_data.py) producing realistic behavioral-drift transaction sequences.</w:t>
+        <w:t xml:space="preserve">Custom synthetic data generator (data/generate_synthetic_data.py) producing per-customer transaction histories with injected fraud episodes.</w:t>
       </w:r>
     </w:p>
     <w:p>
@@ -1563,7 +1579,7 @@
         <w:jc w:val="both"/>
       </w:pPr>
       <w:r>
-        <w:t xml:space="preserve">The customer’s last 10 transactions’ feature vectors feed the LSTM, which outputs a Risk Score (0–100) — a leading indicator of how risky the customer’s trajectory looks based on activity before the current transaction. The current transaction’s own features, plus that Risk Score, then feed the DNN, which outputs a Fraud Probability (0–100%) for this specific transaction. SHAP wraps the DNN to rank which features drove that probability, and those are mapped to human-readable reasons. Separately, a Behavioral Similarity Score compares the current transaction against the customer’s own historical mean and standard deviation per feature.</w:t>
+        <w:t xml:space="preserve">The customer’s last 10 transactions’ feature vectors feed the LSTM, which outputs a Risk Score (0–100): a historical-risk signal computed from activity before the current transaction. It was intended as a leading indicator; the corrected evaluation found that it does not flag the first fraud of an episode. The current transaction’s own features, plus that Risk Score, then feed the DNN, which outputs a Fraud Probability (0–100%) for this specific transaction. SHAP wraps the DNN to rank which features drove that probability, and those are mapped to human-readable reasons. Separately, a Behavioral Similarity Score compares the current transaction against the customer’s own historical mean and standard deviation per feature.</w:t>
       </w:r>
     </w:p>
     <w:p>
@@ -1647,7 +1663,7 @@
         <w:jc w:val="both"/>
       </w:pPr>
       <w:r>
-        <w:t xml:space="preserve">A real defect was found and fixed during review: for certain transactions, the dashboard showed a low Risk Score (e.g. 8/100) alongside a Fraud Probability of a flat, literal 100.00% — which read as broken or unbelievable, since no calibrated model should ever claim absolute certainty.</w:t>
+        <w:t xml:space="preserve">A real defect was found and fixed during review: for certain transactions, the dashboard showed a low Risk Score (e.g. 8/100) alongside a Fraud Probability of a flat, literal 100.00% — which read as broken or unbelievable, since a model’s fraud score should never be presented as absolute certainty.</w:t>
       </w:r>
     </w:p>
     <w:p>
@@ -1689,7 +1705,7 @@
         <w:spacing w:after="80"/>
       </w:pPr>
       <w:r>
-        <w:t xml:space="preserve">Added a defensive clip on the DNN’s normalized input range, and capped the displayed probability below literal 100% — standard practice for any calibrated probabilistic model.</w:t>
+        <w:t xml:space="preserve">Added a defensive clip on the DNN’s normalized input range, and capped the displayed fraud probability below literal 100%, so the model’s fraud score is never presented as absolute certainty. (The score comes from a class-weighted model, so it is not a calibrated probability.)</w:t>
       </w:r>
     </w:p>
     <w:p>
@@ -1728,7 +1744,7 @@
         <w:spacing w:after="80"/>
       </w:pPr>
       <w:r>
-        <w:t xml:space="preserve">Verified the fix against real API calls: previously-saturated cases now return calibrated values (e.g. 99.57%, 99.9%, 86.3%) instead of a flat 100.00%, while a transaction genuinely matching a customer’s normal profile still correctly scores low risk (2.65% fraud probability, 91.5% similarity).</w:t>
+        <w:t xml:space="preserve">Verified the fix against real API calls: previously-saturated cases now return non-saturated fraud scores (e.g. 99.57%, 99.9%, 86.3%) instead of a flat 100.00%, while a transaction genuinely matching a customer’s normal profile still correctly scores low risk (2.65% fraud probability, 91.5% similarity).</w:t>
       </w:r>
     </w:p>
     <w:p>
@@ -1812,33 +1828,33 @@
         <w:jc w:val="both"/>
       </w:pPr>
       <w:r>
-        <w:t xml:space="preserve">A new evaluation module (backend/app/models/evaluate.py) loads both trained models and scores them against the same 80/20 stratified held-out test split used at training time — a genuine generalization check, not a re-fit. Exposed via GET /metrics and surfaced as a dedicated “Model Performance” tab on the dashboard.</w:t>
-      </w:r>
-    </w:p>
-    <w:p>
-      <w:pPr>
-        <w:pStyle w:val="ListParagraph"/>
-        <w:numPr>
-          <w:ilvl w:val="0"/>
-          <w:numId w:val="3"/>
-        </w:numPr>
-        <w:spacing w:after="80"/>
-      </w:pPr>
-      <w:r>
-        <w:t xml:space="preserve">LSTM Risk Predictor: Precision 0.704, Recall 0.915, F1 0.796, AUC-ROC 0.962.</w:t>
-      </w:r>
-    </w:p>
-    <w:p>
-      <w:pPr>
-        <w:pStyle w:val="ListParagraph"/>
-        <w:numPr>
-          <w:ilvl w:val="0"/>
-          <w:numId w:val="3"/>
-        </w:numPr>
-        <w:spacing w:after="80"/>
-      </w:pPr>
-      <w:r>
-        <w:t xml:space="preserve">DNN Fraud Classifier: Precision 0.837, Recall 1.000, F1 0.911, AUC-ROC 1.000.</w:t>
+        <w:t xml:space="preserve">A new evaluation module (backend/app/models/evaluate.py) loads both trained models and scores them against the same 80/20 stratified held-out test split used at training time. (Superseded: that random split mixed future transactions into training. The corrected time-based evaluation is in docs/EVALUATION.md.) Exposed via GET /metrics and surfaced as a dedicated “Model Performance” tab on the dashboard.</w:t>
+      </w:r>
+    </w:p>
+    <w:p>
+      <w:pPr>
+        <w:pStyle w:val="ListParagraph"/>
+        <w:numPr>
+          <w:ilvl w:val="0"/>
+          <w:numId w:val="3"/>
+        </w:numPr>
+        <w:spacing w:after="80"/>
+      </w:pPr>
+      <w:r>
+        <w:t xml:space="preserve">LSTM Risk Predictor (original, superseded evaluation): Precision 0.704, Recall 0.915, F1 0.796, AUC-ROC 0.962.</w:t>
+      </w:r>
+    </w:p>
+    <w:p>
+      <w:pPr>
+        <w:pStyle w:val="ListParagraph"/>
+        <w:numPr>
+          <w:ilvl w:val="0"/>
+          <w:numId w:val="3"/>
+        </w:numPr>
+        <w:spacing w:after="80"/>
+      </w:pPr>
+      <w:r>
+        <w:t xml:space="preserve">DNN Fraud Classifier (original, superseded evaluation): Precision 0.837, Recall 1.000, F1 0.911, AUC-ROC 1.000.</w:t>
       </w:r>
     </w:p>
     <w:p>

</xml_diff>